<commit_message>
Docs: Implement detailed architecture feedback into Mermaid diagram and text, including logic gaps, structure, data layer updates, and presentation
</commit_message>
<xml_diff>
--- a/MediKiosk_Project_Draft_V2.docx
+++ b/MediKiosk_Project_Draft_V2.docx
@@ -336,7 +336,7 @@
         <w:t>Emergency Safety Net:</w:t>
       </w:r>
       <w:r>
-        <w:t xml:space="preserve"> If red-flag symptoms are detected, ARIA instantly halts the interview and triggers an immediate triage alert.</w:t>
+        <w:t xml:space="preserve"> A dual-check system (LLM tagging + deterministic regex keyword rules for chest pain, unconsciousness, severe bleeding) evaluates every response. If an emergency is detected, it triggers a UI alarm, automatically writes a critical-priority ticket to the queue database, and pushes a real-time alert to the doctor\'s panel.</w:t>
       </w:r>
     </w:p>
     <w:p>
@@ -1040,47 +1040,981 @@
       </w:r>
     </w:p>
     <w:p>
-      <w:r>
-        <w:drawing>
-          <wp:inline xmlns:a="http://schemas.openxmlformats.org/drawingml/2006/main" xmlns:pic="http://schemas.openxmlformats.org/drawingml/2006/picture">
-            <wp:extent cx="5486400" cy="5545753"/>
-            <wp:docPr id="1" name="Picture 1"/>
-            <wp:cNvGraphicFramePr>
-              <a:graphicFrameLocks noChangeAspect="1"/>
-            </wp:cNvGraphicFramePr>
-            <a:graphic>
-              <a:graphicData uri="http://schemas.openxmlformats.org/drawingml/2006/picture">
-                <pic:pic>
-                  <pic:nvPicPr>
-                    <pic:cNvPr id="0" name="temp_mermaid.png"/>
-                    <pic:cNvPicPr/>
-                  </pic:nvPicPr>
-                  <pic:blipFill>
-                    <a:blip r:embed="rId9"/>
-                    <a:stretch>
-                      <a:fillRect/>
-                    </a:stretch>
-                  </pic:blipFill>
-                  <pic:spPr>
-                    <a:xfrm>
-                      <a:off x="0" y="0"/>
-                      <a:ext cx="5486400" cy="5545753"/>
-                    </a:xfrm>
-                    <a:prstGeom prst="rect"/>
-                  </pic:spPr>
-                </pic:pic>
-              </a:graphicData>
-            </a:graphic>
-          </wp:inline>
-        </w:drawing>
-      </w:r>
-    </w:p>
-    <w:p>
-      <w:pPr>
-        <w:pStyle w:val="Caption"/>
-      </w:pPr>
-      <w:r>
-        <w:t>Figure: Architecture Data Flow</w:t>
+      <w:pPr>
+        <w:pStyle w:val="IntenseQuote"/>
+      </w:pPr>
+      <w:r>
+        <w:t>[Failed to fetch Mermaid image from API. Source code below:]</w:t>
+      </w:r>
+    </w:p>
+    <w:p>
+      <w:r>
+        <w:rPr>
+          <w:i/>
+        </w:rPr>
+        <w:t>--- Mermaid Code ---</w:t>
+      </w:r>
+    </w:p>
+    <w:p>
+      <w:pPr>
+        <w:pStyle w:val="NoSpacing"/>
+      </w:pPr>
+      <w:r>
+        <w:rPr>
+          <w:rFonts w:ascii="Courier New" w:hAnsi="Courier New"/>
+          <w:sz w:val="18"/>
+        </w:rPr>
+        <w:t>graph TD</w:t>
+      </w:r>
+    </w:p>
+    <w:p>
+      <w:pPr>
+        <w:pStyle w:val="NoSpacing"/>
+      </w:pPr>
+      <w:r>
+        <w:rPr>
+          <w:rFonts w:ascii="Courier New" w:hAnsi="Courier New"/>
+          <w:sz w:val="18"/>
+        </w:rPr>
+        <w:t xml:space="preserve">    classDef frontend fill:#e0f2fe,stroke:#0284c7,stroke-width:2px;</w:t>
+      </w:r>
+    </w:p>
+    <w:p>
+      <w:pPr>
+        <w:pStyle w:val="NoSpacing"/>
+      </w:pPr>
+      <w:r>
+        <w:rPr>
+          <w:rFonts w:ascii="Courier New" w:hAnsi="Courier New"/>
+          <w:sz w:val="18"/>
+        </w:rPr>
+        <w:t xml:space="preserve">    classDef api fill:#f0fdf4,stroke:#16a34a,stroke-width:2px;</w:t>
+      </w:r>
+    </w:p>
+    <w:p>
+      <w:pPr>
+        <w:pStyle w:val="NoSpacing"/>
+      </w:pPr>
+      <w:r>
+        <w:rPr>
+          <w:rFonts w:ascii="Courier New" w:hAnsi="Courier New"/>
+          <w:sz w:val="18"/>
+        </w:rPr>
+        <w:t xml:space="preserve">    classDef external fill:#fdf4ff,stroke:#c026d3,stroke-width:2px;</w:t>
+      </w:r>
+    </w:p>
+    <w:p>
+      <w:pPr>
+        <w:pStyle w:val="NoSpacing"/>
+      </w:pPr>
+      <w:r>
+        <w:rPr>
+          <w:rFonts w:ascii="Courier New" w:hAnsi="Courier New"/>
+          <w:sz w:val="18"/>
+        </w:rPr>
+        <w:t xml:space="preserve">    classDef storage fill:#fffbeb,stroke:#d97706,stroke-width:2px;</w:t>
+      </w:r>
+    </w:p>
+    <w:p>
+      <w:pPr>
+        <w:pStyle w:val="NoSpacing"/>
+      </w:pPr>
+      <w:r>
+        <w:rPr>
+          <w:rFonts w:ascii="Courier New" w:hAnsi="Courier New"/>
+          <w:sz w:val="18"/>
+        </w:rPr>
+        <w:t xml:space="preserve">    classDef emergency fill:#fef2f2,stroke:#dc2626,stroke-width:3px,color:#dc2626;</w:t>
+      </w:r>
+    </w:p>
+    <w:p>
+      <w:pPr>
+        <w:pStyle w:val="NoSpacing"/>
+      </w:pPr>
+      <w:r>
+        <w:rPr>
+          <w:rFonts w:ascii="Courier New" w:hAnsi="Courier New"/>
+          <w:sz w:val="18"/>
+        </w:rPr>
+        <w:t xml:space="preserve">    classDef legend fill:#f8fafc,stroke:#94a3b8,stroke-width:1px,stroke-dasharray: 5 5;</w:t>
+      </w:r>
+    </w:p>
+    <w:p>
+      <w:pPr>
+        <w:pStyle w:val="NoSpacing"/>
+      </w:pPr>
+      <w:r>
+        <w:rPr>
+          <w:rFonts w:ascii="Courier New" w:hAnsi="Courier New"/>
+          <w:sz w:val="18"/>
+        </w:rPr>
+      </w:r>
+    </w:p>
+    <w:p>
+      <w:pPr>
+        <w:pStyle w:val="NoSpacing"/>
+      </w:pPr>
+      <w:r>
+        <w:rPr>
+          <w:rFonts w:ascii="Courier New" w:hAnsi="Courier New"/>
+          <w:sz w:val="18"/>
+        </w:rPr>
+        <w:t xml:space="preserve">    %% 1. Frontend Layer</w:t>
+      </w:r>
+    </w:p>
+    <w:p>
+      <w:pPr>
+        <w:pStyle w:val="NoSpacing"/>
+      </w:pPr>
+      <w:r>
+        <w:rPr>
+          <w:rFonts w:ascii="Courier New" w:hAnsi="Courier New"/>
+          <w:sz w:val="18"/>
+        </w:rPr>
+        <w:t xml:space="preserve">    subgraph Frontend [1. Client Interfaces]</w:t>
+      </w:r>
+    </w:p>
+    <w:p>
+      <w:pPr>
+        <w:pStyle w:val="NoSpacing"/>
+      </w:pPr>
+      <w:r>
+        <w:rPr>
+          <w:rFonts w:ascii="Courier New" w:hAnsi="Courier New"/>
+          <w:sz w:val="18"/>
+        </w:rPr>
+        <w:t xml:space="preserve">        A[1. index.html&lt;br&gt;Patient ABHA Auth]:::frontend</w:t>
+      </w:r>
+    </w:p>
+    <w:p>
+      <w:pPr>
+        <w:pStyle w:val="NoSpacing"/>
+      </w:pPr>
+      <w:r>
+        <w:rPr>
+          <w:rFonts w:ascii="Courier New" w:hAnsi="Courier New"/>
+          <w:sz w:val="18"/>
+        </w:rPr>
+        <w:t xml:space="preserve">        B[2. chat.html&lt;br&gt;Voice/Text UI]:::frontend</w:t>
+      </w:r>
+    </w:p>
+    <w:p>
+      <w:pPr>
+        <w:pStyle w:val="NoSpacing"/>
+      </w:pPr>
+      <w:r>
+        <w:rPr>
+          <w:rFonts w:ascii="Courier New" w:hAnsi="Courier New"/>
+          <w:sz w:val="18"/>
+        </w:rPr>
+        <w:t xml:space="preserve">        Doc[6. doctor_panel.html&lt;br&gt;Doctor Login &amp; Queue]:::frontend</w:t>
+      </w:r>
+    </w:p>
+    <w:p>
+      <w:pPr>
+        <w:pStyle w:val="NoSpacing"/>
+      </w:pPr>
+      <w:r>
+        <w:rPr>
+          <w:rFonts w:ascii="Courier New" w:hAnsi="Courier New"/>
+          <w:sz w:val="18"/>
+        </w:rPr>
+        <w:t xml:space="preserve">        SSEUI[status.html&lt;br&gt;Live Patient Screen]:::frontend</w:t>
+      </w:r>
+    </w:p>
+    <w:p>
+      <w:pPr>
+        <w:pStyle w:val="NoSpacing"/>
+      </w:pPr>
+      <w:r>
+        <w:rPr>
+          <w:rFonts w:ascii="Courier New" w:hAnsi="Courier New"/>
+          <w:sz w:val="18"/>
+        </w:rPr>
+        <w:t xml:space="preserve">        Man[Nurse Desk&lt;br&gt;Manual Fallback]:::frontend</w:t>
+      </w:r>
+    </w:p>
+    <w:p>
+      <w:pPr>
+        <w:pStyle w:val="NoSpacing"/>
+      </w:pPr>
+      <w:r>
+        <w:rPr>
+          <w:rFonts w:ascii="Courier New" w:hAnsi="Courier New"/>
+          <w:sz w:val="18"/>
+        </w:rPr>
+        <w:t xml:space="preserve">    end</w:t>
+      </w:r>
+    </w:p>
+    <w:p>
+      <w:pPr>
+        <w:pStyle w:val="NoSpacing"/>
+      </w:pPr>
+      <w:r>
+        <w:rPr>
+          <w:rFonts w:ascii="Courier New" w:hAnsi="Courier New"/>
+          <w:sz w:val="18"/>
+        </w:rPr>
+      </w:r>
+    </w:p>
+    <w:p>
+      <w:pPr>
+        <w:pStyle w:val="NoSpacing"/>
+      </w:pPr>
+      <w:r>
+        <w:rPr>
+          <w:rFonts w:ascii="Courier New" w:hAnsi="Courier New"/>
+          <w:sz w:val="18"/>
+        </w:rPr>
+        <w:t xml:space="preserve">    %% 2. API Layer</w:t>
+      </w:r>
+    </w:p>
+    <w:p>
+      <w:pPr>
+        <w:pStyle w:val="NoSpacing"/>
+      </w:pPr>
+      <w:r>
+        <w:rPr>
+          <w:rFonts w:ascii="Courier New" w:hAnsi="Courier New"/>
+          <w:sz w:val="18"/>
+        </w:rPr>
+        <w:t xml:space="preserve">    subgraph API [2. FastAPI Backend]</w:t>
+      </w:r>
+    </w:p>
+    <w:p>
+      <w:pPr>
+        <w:pStyle w:val="NoSpacing"/>
+      </w:pPr>
+      <w:r>
+        <w:rPr>
+          <w:rFonts w:ascii="Courier New" w:hAnsi="Courier New"/>
+          <w:sz w:val="18"/>
+        </w:rPr>
+        <w:t xml:space="preserve">        AuthE[Auth Endpoint]:::api</w:t>
+      </w:r>
+    </w:p>
+    <w:p>
+      <w:pPr>
+        <w:pStyle w:val="NoSpacing"/>
+      </w:pPr>
+      <w:r>
+        <w:rPr>
+          <w:rFonts w:ascii="Courier New" w:hAnsi="Courier New"/>
+          <w:sz w:val="18"/>
+        </w:rPr>
+        <w:t xml:space="preserve">        ChatE[3. /api/chat Endpoint]:::api</w:t>
+      </w:r>
+    </w:p>
+    <w:p>
+      <w:pPr>
+        <w:pStyle w:val="NoSpacing"/>
+      </w:pPr>
+      <w:r>
+        <w:rPr>
+          <w:rFonts w:ascii="Courier New" w:hAnsi="Courier New"/>
+          <w:sz w:val="18"/>
+        </w:rPr>
+        <w:t xml:space="preserve">        OCRE[/api/scan_document]:::api</w:t>
+      </w:r>
+    </w:p>
+    <w:p>
+      <w:pPr>
+        <w:pStyle w:val="NoSpacing"/>
+      </w:pPr>
+      <w:r>
+        <w:rPr>
+          <w:rFonts w:ascii="Courier New" w:hAnsi="Courier New"/>
+          <w:sz w:val="18"/>
+        </w:rPr>
+        <w:t xml:space="preserve">        SumE[4. /api/generate_summary]:::api</w:t>
+      </w:r>
+    </w:p>
+    <w:p>
+      <w:pPr>
+        <w:pStyle w:val="NoSpacing"/>
+      </w:pPr>
+      <w:r>
+        <w:rPr>
+          <w:rFonts w:ascii="Courier New" w:hAnsi="Courier New"/>
+          <w:sz w:val="18"/>
+        </w:rPr>
+        <w:t xml:space="preserve">        AppE[7. /api/approve]:::api</w:t>
+      </w:r>
+    </w:p>
+    <w:p>
+      <w:pPr>
+        <w:pStyle w:val="NoSpacing"/>
+      </w:pPr>
+      <w:r>
+        <w:rPr>
+          <w:rFonts w:ascii="Courier New" w:hAnsi="Courier New"/>
+          <w:sz w:val="18"/>
+        </w:rPr>
+        <w:t xml:space="preserve">        PubSub[[Redis Pub/Sub&lt;br&gt;Event Broadcaster]]:::api</w:t>
+      </w:r>
+    </w:p>
+    <w:p>
+      <w:pPr>
+        <w:pStyle w:val="NoSpacing"/>
+      </w:pPr>
+      <w:r>
+        <w:rPr>
+          <w:rFonts w:ascii="Courier New" w:hAnsi="Courier New"/>
+          <w:sz w:val="18"/>
+        </w:rPr>
+        <w:t xml:space="preserve">        EFlag{"Rules and LLM Emergency Check"}:::emergency</w:t>
+      </w:r>
+    </w:p>
+    <w:p>
+      <w:pPr>
+        <w:pStyle w:val="NoSpacing"/>
+      </w:pPr>
+      <w:r>
+        <w:rPr>
+          <w:rFonts w:ascii="Courier New" w:hAnsi="Courier New"/>
+          <w:sz w:val="18"/>
+        </w:rPr>
+        <w:t xml:space="preserve">        Alert[Push Critical Ticket]:::emergency</w:t>
+      </w:r>
+    </w:p>
+    <w:p>
+      <w:pPr>
+        <w:pStyle w:val="NoSpacing"/>
+      </w:pPr>
+      <w:r>
+        <w:rPr>
+          <w:rFonts w:ascii="Courier New" w:hAnsi="Courier New"/>
+          <w:sz w:val="18"/>
+        </w:rPr>
+        <w:t xml:space="preserve">    end</w:t>
+      </w:r>
+    </w:p>
+    <w:p>
+      <w:pPr>
+        <w:pStyle w:val="NoSpacing"/>
+      </w:pPr>
+      <w:r>
+        <w:rPr>
+          <w:rFonts w:ascii="Courier New" w:hAnsi="Courier New"/>
+          <w:sz w:val="18"/>
+        </w:rPr>
+      </w:r>
+    </w:p>
+    <w:p>
+      <w:pPr>
+        <w:pStyle w:val="NoSpacing"/>
+      </w:pPr>
+      <w:r>
+        <w:rPr>
+          <w:rFonts w:ascii="Courier New" w:hAnsi="Courier New"/>
+          <w:sz w:val="18"/>
+        </w:rPr>
+        <w:t xml:space="preserve">    %% 3. External Services</w:t>
+      </w:r>
+    </w:p>
+    <w:p>
+      <w:pPr>
+        <w:pStyle w:val="NoSpacing"/>
+      </w:pPr>
+      <w:r>
+        <w:rPr>
+          <w:rFonts w:ascii="Courier New" w:hAnsi="Courier New"/>
+          <w:sz w:val="18"/>
+        </w:rPr>
+        <w:t xml:space="preserve">    subgraph External [3. External APIs]</w:t>
+      </w:r>
+    </w:p>
+    <w:p>
+      <w:pPr>
+        <w:pStyle w:val="NoSpacing"/>
+      </w:pPr>
+      <w:r>
+        <w:rPr>
+          <w:rFonts w:ascii="Courier New" w:hAnsi="Courier New"/>
+          <w:sz w:val="18"/>
+        </w:rPr>
+        <w:t xml:space="preserve">        ABDM[(ABDM Network)]:::external</w:t>
+      </w:r>
+    </w:p>
+    <w:p>
+      <w:pPr>
+        <w:pStyle w:val="NoSpacing"/>
+      </w:pPr>
+      <w:r>
+        <w:rPr>
+          <w:rFonts w:ascii="Courier New" w:hAnsi="Courier New"/>
+          <w:sz w:val="18"/>
+        </w:rPr>
+        <w:t xml:space="preserve">        Groq((Groq API&lt;br&gt;Llama-3.1)):::external</w:t>
+      </w:r>
+    </w:p>
+    <w:p>
+      <w:pPr>
+        <w:pStyle w:val="NoSpacing"/>
+      </w:pPr>
+      <w:r>
+        <w:rPr>
+          <w:rFonts w:ascii="Courier New" w:hAnsi="Courier New"/>
+          <w:sz w:val="18"/>
+        </w:rPr>
+        <w:t xml:space="preserve">        Gemini((Gemini API&lt;br&gt;Flash-Lite)):::external</w:t>
+      </w:r>
+    </w:p>
+    <w:p>
+      <w:pPr>
+        <w:pStyle w:val="NoSpacing"/>
+      </w:pPr>
+      <w:r>
+        <w:rPr>
+          <w:rFonts w:ascii="Courier New" w:hAnsi="Courier New"/>
+          <w:sz w:val="18"/>
+        </w:rPr>
+        <w:t xml:space="preserve">    end</w:t>
+      </w:r>
+    </w:p>
+    <w:p>
+      <w:pPr>
+        <w:pStyle w:val="NoSpacing"/>
+      </w:pPr>
+      <w:r>
+        <w:rPr>
+          <w:rFonts w:ascii="Courier New" w:hAnsi="Courier New"/>
+          <w:sz w:val="18"/>
+        </w:rPr>
+      </w:r>
+    </w:p>
+    <w:p>
+      <w:pPr>
+        <w:pStyle w:val="NoSpacing"/>
+      </w:pPr>
+      <w:r>
+        <w:rPr>
+          <w:rFonts w:ascii="Courier New" w:hAnsi="Courier New"/>
+          <w:sz w:val="18"/>
+        </w:rPr>
+        <w:t xml:space="preserve">    %% 4. Storage Layer</w:t>
+      </w:r>
+    </w:p>
+    <w:p>
+      <w:pPr>
+        <w:pStyle w:val="NoSpacing"/>
+      </w:pPr>
+      <w:r>
+        <w:rPr>
+          <w:rFonts w:ascii="Courier New" w:hAnsi="Courier New"/>
+          <w:sz w:val="18"/>
+        </w:rPr>
+        <w:t xml:space="preserve">    subgraph Storage [4. Data Persistence]</w:t>
+      </w:r>
+    </w:p>
+    <w:p>
+      <w:pPr>
+        <w:pStyle w:val="NoSpacing"/>
+      </w:pPr>
+      <w:r>
+        <w:rPr>
+          <w:rFonts w:ascii="Courier New" w:hAnsi="Courier New"/>
+          <w:sz w:val="18"/>
+        </w:rPr>
+        <w:t xml:space="preserve">        DB[(PostgreSQL / SQLite)]:::storage</w:t>
+      </w:r>
+    </w:p>
+    <w:p>
+      <w:pPr>
+        <w:pStyle w:val="NoSpacing"/>
+      </w:pPr>
+      <w:r>
+        <w:rPr>
+          <w:rFonts w:ascii="Courier New" w:hAnsi="Courier New"/>
+          <w:sz w:val="18"/>
+        </w:rPr>
+        <w:t xml:space="preserve">    end</w:t>
+      </w:r>
+    </w:p>
+    <w:p>
+      <w:pPr>
+        <w:pStyle w:val="NoSpacing"/>
+      </w:pPr>
+      <w:r>
+        <w:rPr>
+          <w:rFonts w:ascii="Courier New" w:hAnsi="Courier New"/>
+          <w:sz w:val="18"/>
+        </w:rPr>
+      </w:r>
+    </w:p>
+    <w:p>
+      <w:pPr>
+        <w:pStyle w:val="NoSpacing"/>
+      </w:pPr>
+      <w:r>
+        <w:rPr>
+          <w:rFonts w:ascii="Courier New" w:hAnsi="Courier New"/>
+          <w:sz w:val="18"/>
+        </w:rPr>
+        <w:t xml:space="preserve">    %% Legend</w:t>
+      </w:r>
+    </w:p>
+    <w:p>
+      <w:pPr>
+        <w:pStyle w:val="NoSpacing"/>
+      </w:pPr>
+      <w:r>
+        <w:rPr>
+          <w:rFonts w:ascii="Courier New" w:hAnsi="Courier New"/>
+          <w:sz w:val="18"/>
+        </w:rPr>
+        <w:t xml:space="preserve">    subgraph Legend</w:t>
+      </w:r>
+    </w:p>
+    <w:p>
+      <w:pPr>
+        <w:pStyle w:val="NoSpacing"/>
+      </w:pPr>
+      <w:r>
+        <w:rPr>
+          <w:rFonts w:ascii="Courier New" w:hAnsi="Courier New"/>
+          <w:sz w:val="18"/>
+        </w:rPr>
+        <w:t xml:space="preserve">        L1[Solid: Main Flow]:::legend</w:t>
+      </w:r>
+    </w:p>
+    <w:p>
+      <w:pPr>
+        <w:pStyle w:val="NoSpacing"/>
+      </w:pPr>
+      <w:r>
+        <w:rPr>
+          <w:rFonts w:ascii="Courier New" w:hAnsi="Courier New"/>
+          <w:sz w:val="18"/>
+        </w:rPr>
+        <w:t xml:space="preserve">        L2-.-&gt;|Dotted: Fallback|L3[...]:::legend</w:t>
+      </w:r>
+    </w:p>
+    <w:p>
+      <w:pPr>
+        <w:pStyle w:val="NoSpacing"/>
+      </w:pPr>
+      <w:r>
+        <w:rPr>
+          <w:rFonts w:ascii="Courier New" w:hAnsi="Courier New"/>
+          <w:sz w:val="18"/>
+        </w:rPr>
+        <w:t xml:space="preserve">        L4==&gt;|Thick: Emergency|L5[...]:::legend</w:t>
+      </w:r>
+    </w:p>
+    <w:p>
+      <w:pPr>
+        <w:pStyle w:val="NoSpacing"/>
+      </w:pPr>
+      <w:r>
+        <w:rPr>
+          <w:rFonts w:ascii="Courier New" w:hAnsi="Courier New"/>
+          <w:sz w:val="18"/>
+        </w:rPr>
+        <w:t xml:space="preserve">    end</w:t>
+      </w:r>
+    </w:p>
+    <w:p>
+      <w:pPr>
+        <w:pStyle w:val="NoSpacing"/>
+      </w:pPr>
+      <w:r>
+        <w:rPr>
+          <w:rFonts w:ascii="Courier New" w:hAnsi="Courier New"/>
+          <w:sz w:val="18"/>
+        </w:rPr>
+      </w:r>
+    </w:p>
+    <w:p>
+      <w:pPr>
+        <w:pStyle w:val="NoSpacing"/>
+      </w:pPr>
+      <w:r>
+        <w:rPr>
+          <w:rFonts w:ascii="Courier New" w:hAnsi="Courier New"/>
+          <w:sz w:val="18"/>
+        </w:rPr>
+        <w:t xml:space="preserve">    %% Flow Definitions</w:t>
+      </w:r>
+    </w:p>
+    <w:p>
+      <w:pPr>
+        <w:pStyle w:val="NoSpacing"/>
+      </w:pPr>
+      <w:r>
+        <w:rPr>
+          <w:rFonts w:ascii="Courier New" w:hAnsi="Courier New"/>
+          <w:sz w:val="18"/>
+        </w:rPr>
+        <w:t xml:space="preserve">    A --&gt;|Auth Request| AuthE</w:t>
+      </w:r>
+    </w:p>
+    <w:p>
+      <w:pPr>
+        <w:pStyle w:val="NoSpacing"/>
+      </w:pPr>
+      <w:r>
+        <w:rPr>
+          <w:rFonts w:ascii="Courier New" w:hAnsi="Courier New"/>
+          <w:sz w:val="18"/>
+        </w:rPr>
+        <w:t xml:space="preserve">    AuthE --&gt;|Verify| ABDM</w:t>
+      </w:r>
+    </w:p>
+    <w:p>
+      <w:pPr>
+        <w:pStyle w:val="NoSpacing"/>
+      </w:pPr>
+      <w:r>
+        <w:rPr>
+          <w:rFonts w:ascii="Courier New" w:hAnsi="Courier New"/>
+          <w:sz w:val="18"/>
+        </w:rPr>
+        <w:t xml:space="preserve">    AuthE --&gt;|Start Session| B</w:t>
+      </w:r>
+    </w:p>
+    <w:p>
+      <w:pPr>
+        <w:pStyle w:val="NoSpacing"/>
+      </w:pPr>
+      <w:r>
+        <w:rPr>
+          <w:rFonts w:ascii="Courier New" w:hAnsi="Courier New"/>
+          <w:sz w:val="18"/>
+        </w:rPr>
+        <w:t xml:space="preserve">    </w:t>
+      </w:r>
+    </w:p>
+    <w:p>
+      <w:pPr>
+        <w:pStyle w:val="NoSpacing"/>
+      </w:pPr>
+      <w:r>
+        <w:rPr>
+          <w:rFonts w:ascii="Courier New" w:hAnsi="Courier New"/>
+          <w:sz w:val="18"/>
+        </w:rPr>
+        <w:t xml:space="preserve">    B --&gt;|Upload Doc| OCRE</w:t>
+      </w:r>
+    </w:p>
+    <w:p>
+      <w:pPr>
+        <w:pStyle w:val="NoSpacing"/>
+      </w:pPr>
+      <w:r>
+        <w:rPr>
+          <w:rFonts w:ascii="Courier New" w:hAnsi="Courier New"/>
+          <w:sz w:val="18"/>
+        </w:rPr>
+        <w:t xml:space="preserve">    OCRE --&gt;|Vision Task| Gemini</w:t>
+      </w:r>
+    </w:p>
+    <w:p>
+      <w:pPr>
+        <w:pStyle w:val="NoSpacing"/>
+      </w:pPr>
+      <w:r>
+        <w:rPr>
+          <w:rFonts w:ascii="Courier New" w:hAnsi="Courier New"/>
+          <w:sz w:val="18"/>
+        </w:rPr>
+        <w:t xml:space="preserve">    Gemini --&gt;|Extracted Text Context| B</w:t>
+      </w:r>
+    </w:p>
+    <w:p>
+      <w:pPr>
+        <w:pStyle w:val="NoSpacing"/>
+      </w:pPr>
+      <w:r>
+        <w:rPr>
+          <w:rFonts w:ascii="Courier New" w:hAnsi="Courier New"/>
+          <w:sz w:val="18"/>
+        </w:rPr>
+        <w:t xml:space="preserve">    </w:t>
+      </w:r>
+    </w:p>
+    <w:p>
+      <w:pPr>
+        <w:pStyle w:val="NoSpacing"/>
+      </w:pPr>
+      <w:r>
+        <w:rPr>
+          <w:rFonts w:ascii="Courier New" w:hAnsi="Courier New"/>
+          <w:sz w:val="18"/>
+        </w:rPr>
+        <w:t xml:space="preserve">    B --&gt;|Voice/Text| ChatE</w:t>
+      </w:r>
+    </w:p>
+    <w:p>
+      <w:pPr>
+        <w:pStyle w:val="NoSpacing"/>
+      </w:pPr>
+      <w:r>
+        <w:rPr>
+          <w:rFonts w:ascii="Courier New" w:hAnsi="Courier New"/>
+          <w:sz w:val="18"/>
+        </w:rPr>
+        <w:t xml:space="preserve">    ChatE --&gt;|Inference| Groq</w:t>
+      </w:r>
+    </w:p>
+    <w:p>
+      <w:pPr>
+        <w:pStyle w:val="NoSpacing"/>
+      </w:pPr>
+      <w:r>
+        <w:rPr>
+          <w:rFonts w:ascii="Courier New" w:hAnsi="Courier New"/>
+          <w:sz w:val="18"/>
+        </w:rPr>
+        <w:t xml:space="preserve">    Groq --&gt;|Response| EFlag</w:t>
+      </w:r>
+    </w:p>
+    <w:p>
+      <w:pPr>
+        <w:pStyle w:val="NoSpacing"/>
+      </w:pPr>
+      <w:r>
+        <w:rPr>
+          <w:rFonts w:ascii="Courier New" w:hAnsi="Courier New"/>
+          <w:sz w:val="18"/>
+        </w:rPr>
+        <w:t xml:space="preserve">    EFlag ==&gt;|Regex/LLM Flag Found| Alert</w:t>
+      </w:r>
+    </w:p>
+    <w:p>
+      <w:pPr>
+        <w:pStyle w:val="NoSpacing"/>
+      </w:pPr>
+      <w:r>
+        <w:rPr>
+          <w:rFonts w:ascii="Courier New" w:hAnsi="Courier New"/>
+          <w:sz w:val="18"/>
+        </w:rPr>
+        <w:t xml:space="preserve">    Alert ==&gt;|Critical Priority| DB</w:t>
+      </w:r>
+    </w:p>
+    <w:p>
+      <w:pPr>
+        <w:pStyle w:val="NoSpacing"/>
+      </w:pPr>
+      <w:r>
+        <w:rPr>
+          <w:rFonts w:ascii="Courier New" w:hAnsi="Courier New"/>
+          <w:sz w:val="18"/>
+        </w:rPr>
+        <w:t xml:space="preserve">    Alert ==&gt;|Alarm SSE| PubSub</w:t>
+      </w:r>
+    </w:p>
+    <w:p>
+      <w:pPr>
+        <w:pStyle w:val="NoSpacing"/>
+      </w:pPr>
+      <w:r>
+        <w:rPr>
+          <w:rFonts w:ascii="Courier New" w:hAnsi="Courier New"/>
+          <w:sz w:val="18"/>
+        </w:rPr>
+        <w:t xml:space="preserve">    EFlag --&gt;|No Flag| B</w:t>
+      </w:r>
+    </w:p>
+    <w:p>
+      <w:pPr>
+        <w:pStyle w:val="NoSpacing"/>
+      </w:pPr>
+      <w:r>
+        <w:rPr>
+          <w:rFonts w:ascii="Courier New" w:hAnsi="Courier New"/>
+          <w:sz w:val="18"/>
+        </w:rPr>
+        <w:t xml:space="preserve">    </w:t>
+      </w:r>
+    </w:p>
+    <w:p>
+      <w:pPr>
+        <w:pStyle w:val="NoSpacing"/>
+      </w:pPr>
+      <w:r>
+        <w:rPr>
+          <w:rFonts w:ascii="Courier New" w:hAnsi="Courier New"/>
+          <w:sz w:val="18"/>
+        </w:rPr>
+        <w:t xml:space="preserve">    B --&gt;|Finish &amp; Send| SumE</w:t>
+      </w:r>
+    </w:p>
+    <w:p>
+      <w:pPr>
+        <w:pStyle w:val="NoSpacing"/>
+      </w:pPr>
+      <w:r>
+        <w:rPr>
+          <w:rFonts w:ascii="Courier New" w:hAnsi="Courier New"/>
+          <w:sz w:val="18"/>
+        </w:rPr>
+        <w:t xml:space="preserve">    SumE --&gt;|Chat + OCR Context| Groq</w:t>
+      </w:r>
+    </w:p>
+    <w:p>
+      <w:pPr>
+        <w:pStyle w:val="NoSpacing"/>
+      </w:pPr>
+      <w:r>
+        <w:rPr>
+          <w:rFonts w:ascii="Courier New" w:hAnsi="Courier New"/>
+          <w:sz w:val="18"/>
+        </w:rPr>
+        <w:t xml:space="preserve">    SumE --&gt;|Parse JSON| DB</w:t>
+      </w:r>
+    </w:p>
+    <w:p>
+      <w:pPr>
+        <w:pStyle w:val="NoSpacing"/>
+      </w:pPr>
+      <w:r>
+        <w:rPr>
+          <w:rFonts w:ascii="Courier New" w:hAnsi="Courier New"/>
+          <w:sz w:val="18"/>
+        </w:rPr>
+        <w:t xml:space="preserve">    </w:t>
+      </w:r>
+    </w:p>
+    <w:p>
+      <w:pPr>
+        <w:pStyle w:val="NoSpacing"/>
+      </w:pPr>
+      <w:r>
+        <w:rPr>
+          <w:rFonts w:ascii="Courier New" w:hAnsi="Courier New"/>
+          <w:sz w:val="18"/>
+        </w:rPr>
+        <w:t xml:space="preserve">    DB --&gt;|Read Queue| Doc</w:t>
+      </w:r>
+    </w:p>
+    <w:p>
+      <w:pPr>
+        <w:pStyle w:val="NoSpacing"/>
+      </w:pPr>
+      <w:r>
+        <w:rPr>
+          <w:rFonts w:ascii="Courier New" w:hAnsi="Courier New"/>
+          <w:sz w:val="18"/>
+        </w:rPr>
+        <w:t xml:space="preserve">    Doc --&gt;|Review &amp; Approve| AppE</w:t>
+      </w:r>
+    </w:p>
+    <w:p>
+      <w:pPr>
+        <w:pStyle w:val="NoSpacing"/>
+      </w:pPr>
+      <w:r>
+        <w:rPr>
+          <w:rFonts w:ascii="Courier New" w:hAnsi="Courier New"/>
+          <w:sz w:val="18"/>
+        </w:rPr>
+        <w:t xml:space="preserve">    AppE --&gt;|Update DB| DB</w:t>
+      </w:r>
+    </w:p>
+    <w:p>
+      <w:pPr>
+        <w:pStyle w:val="NoSpacing"/>
+      </w:pPr>
+      <w:r>
+        <w:rPr>
+          <w:rFonts w:ascii="Courier New" w:hAnsi="Courier New"/>
+          <w:sz w:val="18"/>
+        </w:rPr>
+        <w:t xml:space="preserve">    AppE --&gt;|Publish Event| PubSub</w:t>
+      </w:r>
+    </w:p>
+    <w:p>
+      <w:pPr>
+        <w:pStyle w:val="NoSpacing"/>
+      </w:pPr>
+      <w:r>
+        <w:rPr>
+          <w:rFonts w:ascii="Courier New" w:hAnsi="Courier New"/>
+          <w:sz w:val="18"/>
+        </w:rPr>
+        <w:t xml:space="preserve">    PubSub --&gt;|SSE Stream| SSEUI</w:t>
+      </w:r>
+    </w:p>
+    <w:p>
+      <w:pPr>
+        <w:pStyle w:val="NoSpacing"/>
+      </w:pPr>
+      <w:r>
+        <w:rPr>
+          <w:rFonts w:ascii="Courier New" w:hAnsi="Courier New"/>
+          <w:sz w:val="18"/>
+        </w:rPr>
+        <w:t xml:space="preserve">    PubSub ==&gt;|Urgent SSE| Doc</w:t>
+      </w:r>
+    </w:p>
+    <w:p>
+      <w:pPr>
+        <w:pStyle w:val="NoSpacing"/>
+      </w:pPr>
+      <w:r>
+        <w:rPr>
+          <w:rFonts w:ascii="Courier New" w:hAnsi="Courier New"/>
+          <w:sz w:val="18"/>
+        </w:rPr>
+        <w:t xml:space="preserve">    </w:t>
+      </w:r>
+    </w:p>
+    <w:p>
+      <w:pPr>
+        <w:pStyle w:val="NoSpacing"/>
+      </w:pPr>
+      <w:r>
+        <w:rPr>
+          <w:rFonts w:ascii="Courier New" w:hAnsi="Courier New"/>
+          <w:sz w:val="18"/>
+        </w:rPr>
+        <w:t xml:space="preserve">    %% Fallback Chain</w:t>
+      </w:r>
+    </w:p>
+    <w:p>
+      <w:pPr>
+        <w:pStyle w:val="NoSpacing"/>
+      </w:pPr>
+      <w:r>
+        <w:rPr>
+          <w:rFonts w:ascii="Courier New" w:hAnsi="Courier New"/>
+          <w:sz w:val="18"/>
+        </w:rPr>
+        <w:t xml:space="preserve">    Groq -.-&gt;|Fallback 1 (Rate Limit)| Gemini</w:t>
+      </w:r>
+    </w:p>
+    <w:p>
+      <w:pPr>
+        <w:pStyle w:val="NoSpacing"/>
+      </w:pPr>
+      <w:r>
+        <w:rPr>
+          <w:rFonts w:ascii="Courier New" w:hAnsi="Courier New"/>
+          <w:sz w:val="18"/>
+        </w:rPr>
+        <w:t xml:space="preserve">    Gemini -.-&gt;|Fallback 2 (All Failed)| Man</w:t>
+      </w:r>
+    </w:p>
+    <w:p>
+      <w:pPr>
+        <w:pStyle w:val="NoSpacing"/>
+      </w:pPr>
+      <w:r>
+        <w:rPr>
+          <w:rFonts w:ascii="Courier New" w:hAnsi="Courier New"/>
+          <w:sz w:val="18"/>
+        </w:rPr>
+        <w:t xml:space="preserve">    OCRE -.-&gt;|OCR Failed| Man</w:t>
+      </w:r>
+    </w:p>
+    <w:p>
+      <w:r>
+        <w:rPr>
+          <w:i/>
+        </w:rPr>
+        <w:t>--------------------</w:t>
       </w:r>
     </w:p>
     <w:p>
@@ -1122,7 +2056,7 @@
         <w:pStyle w:val="ListBullet"/>
       </w:pPr>
       <w:r>
-        <w:t>Process: The system builds a prompt containing the ARIA persona, past medical history, and user input. It calls Groq's `llama-3.1-8b` for ultra-fast inference. If rate-limited, it automatically falls back to `gemini-3.5-flash-lite`.</w:t>
+        <w:t>Process: The system builds a prompt containing the ARIA persona, past medical history, and user input. It calls Groq's `llama-3.1-8b` for ultra-fast inference. If rate-limited or unavailable, it automatically falls back to `gemini-3.5-flash-lite`. If both AI providers completely fail (or if OCR fails), the system initiates a final fallback routing the patient to the manual entry Nurse Desk to guarantee zero service interruption.</w:t>
       </w:r>
     </w:p>
     <w:p>
@@ -1802,12 +2736,28 @@
         <w:pStyle w:val="Heading3"/>
       </w:pPr>
       <w:r>
-        <w:t>8.2 Database Architecture (`session_data.json`)</w:t>
-      </w:r>
-    </w:p>
-    <w:p>
-      <w:r>
-        <w:t>For the hackathon scope, state is persisted in a lightweight JSON file (easily swappable to PostgreSQL/Redis). It contains two primary keys:</w:t>
+        <w:t>8.2 Database &amp; Real-Time Architecture</w:t>
+      </w:r>
+    </w:p>
+    <w:p>
+      <w:r>
+        <w:t>The architecture relies on robust data and event layers:</w:t>
+      </w:r>
+    </w:p>
+    <w:p>
+      <w:pPr>
+        <w:pStyle w:val="ListNumber"/>
+      </w:pPr>
+      <w:r>
+        <w:t>Persistent Storage (PostgreSQL/SQLite): Replaces file-based JSON storage to eliminate race conditions with concurrent kiosks and ensure secure handling of sensitive health data.</w:t>
+      </w:r>
+    </w:p>
+    <w:p>
+      <w:pPr>
+        <w:pStyle w:val="ListNumber"/>
+      </w:pPr>
+      <w:r>
+        <w:t>Event Broadcaster (Redis Pub/Sub): Instead of direct file polling, real-time Server-Sent Events (SSE) are driven by an in-memory Redis event broker, instantly pushing queue changes to `status.html` and urgent alarms to `doctor_panel.html`. It contains two primary keys:</w:t>
       </w:r>
     </w:p>
     <w:p>

</xml_diff>